<commit_message>
Add custody instructions and fix potential missing check when child residence changes
</commit_message>
<xml_diff>
--- a/docassemble/MLHDivorceAndCustody/data/templates/instructions.docx
+++ b/docassemble/MLHDivorceAndCustody/data/templates/instructions.docx
@@ -1057,7 +1057,31 @@
         <w:rPr>
           <w:rFonts w:asciiTheme="minorHAnsi" w:hAnsiTheme="minorHAnsi" w:cstheme="minorHAnsi"/>
         </w:rPr>
-        <w:t xml:space="preserve"> == "</w:t>
+        <w:t xml:space="preserve"> </w:t>
+      </w:r>
+      <w:r>
+        <w:rPr>
+          <w:rFonts w:asciiTheme="minorHAnsi" w:hAnsiTheme="minorHAnsi" w:cstheme="minorHAnsi"/>
+        </w:rPr>
+        <w:t>in</w:t>
+      </w:r>
+      <w:r>
+        <w:rPr>
+          <w:rFonts w:asciiTheme="minorHAnsi" w:hAnsiTheme="minorHAnsi" w:cstheme="minorHAnsi"/>
+        </w:rPr>
+        <w:t xml:space="preserve"> </w:t>
+      </w:r>
+      <w:r>
+        <w:rPr>
+          <w:rFonts w:asciiTheme="minorHAnsi" w:hAnsiTheme="minorHAnsi" w:cstheme="minorHAnsi"/>
+        </w:rPr>
+        <w:t>[</w:t>
+      </w:r>
+      <w:r>
+        <w:rPr>
+          <w:rFonts w:asciiTheme="minorHAnsi" w:hAnsiTheme="minorHAnsi" w:cstheme="minorHAnsi"/>
+        </w:rPr>
+        <w:t>"</w:t>
       </w:r>
       <w:proofErr w:type="spellStart"/>
       <w:r>
@@ -1071,27 +1095,13 @@
         <w:rPr>
           <w:rFonts w:asciiTheme="minorHAnsi" w:hAnsiTheme="minorHAnsi" w:cstheme="minorHAnsi"/>
         </w:rPr>
-        <w:t>"</w:t>
-      </w:r>
-      <w:r>
-        <w:rPr>
-          <w:rFonts w:asciiTheme="minorHAnsi" w:hAnsiTheme="minorHAnsi" w:cstheme="minorHAnsi"/>
-        </w:rPr>
-        <w:t xml:space="preserve"> or </w:t>
-      </w:r>
-      <w:proofErr w:type="spellStart"/>
-      <w:r>
-        <w:rPr>
-          <w:rFonts w:asciiTheme="minorHAnsi" w:hAnsiTheme="minorHAnsi" w:cstheme="minorHAnsi"/>
-        </w:rPr>
-        <w:t>tool_ID</w:t>
-      </w:r>
-      <w:proofErr w:type="spellEnd"/>
-      <w:r>
-        <w:rPr>
-          <w:rFonts w:asciiTheme="minorHAnsi" w:hAnsiTheme="minorHAnsi" w:cstheme="minorHAnsi"/>
-        </w:rPr>
-        <w:t xml:space="preserve"> == “</w:t>
+        <w:t>”,</w:t>
+      </w:r>
+      <w:r>
+        <w:rPr>
+          <w:rFonts w:asciiTheme="minorHAnsi" w:hAnsiTheme="minorHAnsi" w:cstheme="minorHAnsi"/>
+        </w:rPr>
+        <w:t xml:space="preserve"> “</w:t>
       </w:r>
       <w:proofErr w:type="spellStart"/>
       <w:r>
@@ -1106,6 +1116,26 @@
           <w:rFonts w:asciiTheme="minorHAnsi" w:hAnsiTheme="minorHAnsi" w:cstheme="minorHAnsi"/>
         </w:rPr>
         <w:t>”</w:t>
+      </w:r>
+      <w:r>
+        <w:rPr>
+          <w:rFonts w:asciiTheme="minorHAnsi" w:hAnsiTheme="minorHAnsi" w:cstheme="minorHAnsi"/>
+        </w:rPr>
+        <w:t>, “</w:t>
+      </w:r>
+      <w:proofErr w:type="spellStart"/>
+      <w:r>
+        <w:rPr>
+          <w:rFonts w:asciiTheme="minorHAnsi" w:hAnsiTheme="minorHAnsi" w:cstheme="minorHAnsi"/>
+        </w:rPr>
+        <w:t>custody_complaint</w:t>
+      </w:r>
+      <w:proofErr w:type="spellEnd"/>
+      <w:r>
+        <w:rPr>
+          <w:rFonts w:asciiTheme="minorHAnsi" w:hAnsiTheme="minorHAnsi" w:cstheme="minorHAnsi"/>
+        </w:rPr>
+        <w:t>”]</w:t>
       </w:r>
       <w:r>
         <w:rPr>
@@ -1125,7 +1155,13 @@
       </w:pPr>
       <w:r>
         <w:lastRenderedPageBreak/>
-        <w:t xml:space="preserve">{% if </w:t>
+        <w:t>{%</w:t>
+      </w:r>
+      <w:r>
+        <w:t>p</w:t>
+      </w:r>
+      <w:r>
+        <w:t xml:space="preserve"> if </w:t>
       </w:r>
       <w:proofErr w:type="spellStart"/>
       <w:r>
@@ -1209,7 +1245,13 @@
         <w:pStyle w:val="Normalforinsertedinstructions"/>
       </w:pPr>
       <w:r>
-        <w:t xml:space="preserve">{% </w:t>
+        <w:t>{%</w:t>
+      </w:r>
+      <w:r>
+        <w:t>p</w:t>
+      </w:r>
+      <w:r>
+        <w:t xml:space="preserve"> </w:t>
       </w:r>
       <w:proofErr w:type="spellStart"/>
       <w:r>
@@ -1377,8 +1419,89 @@
         <w:pStyle w:val="Normalforinsertedinstructions"/>
       </w:pPr>
       <w:r>
-        <w:t>{% endif %}</w:t>
-      </w:r>
+        <w:t xml:space="preserve">{%p </w:t>
+      </w:r>
+      <w:proofErr w:type="spellStart"/>
+      <w:r>
+        <w:t>elif</w:t>
+      </w:r>
+      <w:proofErr w:type="spellEnd"/>
+      <w:r>
+        <w:t xml:space="preserve"> </w:t>
+      </w:r>
+      <w:proofErr w:type="spellStart"/>
+      <w:r>
+        <w:t>tool_ID</w:t>
+      </w:r>
+      <w:proofErr w:type="spellEnd"/>
+      <w:r>
+        <w:t xml:space="preserve"> == "</w:t>
+      </w:r>
+      <w:proofErr w:type="spellStart"/>
+      <w:r>
+        <w:t>custody_complaint</w:t>
+      </w:r>
+      <w:proofErr w:type="spellEnd"/>
+      <w:proofErr w:type="gramStart"/>
+      <w:r>
+        <w:t xml:space="preserve">" </w:t>
+      </w:r>
+      <w:r>
+        <w:t>%}</w:t>
+      </w:r>
+      <w:proofErr w:type="gramEnd"/>
+    </w:p>
+    <w:p>
+      <w:pPr>
+        <w:pStyle w:val="Normalforinsertedinstructions"/>
+      </w:pPr>
+      <w:r>
+        <w:t xml:space="preserve">{{p </w:t>
+      </w:r>
+      <w:proofErr w:type="spellStart"/>
+      <w:r>
+        <w:t>include_docx_template</w:t>
+      </w:r>
+      <w:proofErr w:type="spellEnd"/>
+      <w:r>
+        <w:t>(</w:t>
+      </w:r>
+      <w:r>
+        <w:t>‘instructions_custody_complaint</w:t>
+      </w:r>
+      <w:r>
+        <w:t>.docx</w:t>
+      </w:r>
+      <w:r>
+        <w:t>’</w:t>
+      </w:r>
+      <w:proofErr w:type="gramStart"/>
+      <w:r>
+        <w:t>) }</w:t>
+      </w:r>
+      <w:proofErr w:type="gramEnd"/>
+      <w:r>
+        <w:t>}</w:t>
+      </w:r>
+    </w:p>
+    <w:p>
+      <w:pPr>
+        <w:pStyle w:val="Normalforinsertedinstructions"/>
+      </w:pPr>
+      <w:r>
+        <w:t>{%</w:t>
+      </w:r>
+      <w:r>
+        <w:t>p</w:t>
+      </w:r>
+      <w:r>
+        <w:t xml:space="preserve"> </w:t>
+      </w:r>
+      <w:proofErr w:type="gramStart"/>
+      <w:r>
+        <w:t>endif %}</w:t>
+      </w:r>
+      <w:proofErr w:type="gramEnd"/>
     </w:p>
     <w:p>
       <w:pPr>
@@ -3704,6 +3827,7 @@
   <w:style w:type="character" w:default="1" w:styleId="DefaultParagraphFont">
     <w:name w:val="Default Paragraph Font"/>
     <w:uiPriority w:val="1"/>
+    <w:semiHidden/>
     <w:unhideWhenUsed/>
   </w:style>
   <w:style w:type="table" w:default="1" w:styleId="TableNormal">
@@ -4235,28 +4359,28 @@
 </file>
 
 <file path=customXml/item1.xml><?xml version="1.0" encoding="utf-8"?>
-<b:Sources xmlns:b="http://schemas.openxmlformats.org/officeDocument/2006/bibliography" xmlns="http://schemas.openxmlformats.org/officeDocument/2006/bibliography" SelectedStyle="\APASixthEditionOfficeOnline.xsl" StyleName="APA" Version="6"/>
-</file>
-
-<file path=customXml/item2.xml><?xml version="1.0" encoding="utf-8"?>
 <go:gDocsCustomXmlDataStorage xmlns:go="http://customooxmlschemas.google.com/" xmlns:r="http://schemas.openxmlformats.org/officeDocument/2006/relationships" uri="GoogleDocsCustomDataVersion2">
   <go:docsCustomData xmlns:go="http://customooxmlschemas.google.com/" roundtripDataSignature="AMtx7mjac1FaFv6WV3g0GhcUIQ9kG0o+yg==">CgMxLjAyDmgubjh0aHd2ZHFzMTk0MghoLmdqZGd4czIOaC56N2hubnB1aWk1NDkyDWguc3hkdG9pMzhvYmkyDmguNWY0ZXAwcWVlOXRlMg5oLmVqdDhyOXF0bXp6djIOaC4yOWpnN3o3Y2I3bGIyDmguanM4cTNwM3I0eDZjMg5oLnYzbTFuaXhkbzBwejIOaC5wZzd4dGp6Y2t3dWkyDmgueTE0MHhvdmdnYml0Mg5oLjRocjAxMWhrOXVyNjIOaC5xMTI4N2VvNmMyd24yDmguODY5YjBrbWEwNmtsMg5oLm1hczdybXljNW82ejgAciExV3BDbUx3RGV0a2poVzFWLUZiZXdyanhaTmV2Wm8tWm0=</go:docsCustomData>
 </go:gDocsCustomXmlDataStorage>
 </file>
 
-<file path=customXml/itemProps1.xml><?xml version="1.0" encoding="utf-8"?>
-<ds:datastoreItem xmlns:ds="http://schemas.openxmlformats.org/officeDocument/2006/customXml" ds:itemID="{D17ADB1C-BB67-458D-A072-D9E3A76A5AA9}">
-  <ds:schemaRefs>
-    <ds:schemaRef ds:uri="http://schemas.openxmlformats.org/officeDocument/2006/bibliography"/>
-  </ds:schemaRefs>
-</ds:datastoreItem>
+<file path=customXml/item2.xml><?xml version="1.0" encoding="utf-8"?>
+<b:Sources xmlns:b="http://schemas.openxmlformats.org/officeDocument/2006/bibliography" xmlns="http://schemas.openxmlformats.org/officeDocument/2006/bibliography" SelectedStyle="\APASixthEditionOfficeOnline.xsl" StyleName="APA" Version="6"/>
 </file>
 
-<file path=customXml/itemProps2.xml><?xml version="1.0" encoding="utf-8"?>
+<file path=customXml/itemProps1.xml><?xml version="1.0" encoding="utf-8"?>
 <ds:datastoreItem xmlns:ds="http://schemas.openxmlformats.org/officeDocument/2006/customXml" ds:itemID="{11111111-1234-1234-1234-123412341234}">
   <ds:schemaRefs>
     <ds:schemaRef ds:uri="http://customooxmlschemas.google.com/"/>
     <ds:schemaRef ds:uri="http://schemas.openxmlformats.org/officeDocument/2006/relationships"/>
   </ds:schemaRefs>
 </ds:datastoreItem>
+</file>
+
+<file path=customXml/itemProps2.xml><?xml version="1.0" encoding="utf-8"?>
+<ds:datastoreItem xmlns:ds="http://schemas.openxmlformats.org/officeDocument/2006/customXml" ds:itemID="{D17ADB1C-BB67-458D-A072-D9E3A76A5AA9}">
+  <ds:schemaRefs>
+    <ds:schemaRef ds:uri="http://schemas.openxmlformats.org/officeDocument/2006/bibliography"/>
+  </ds:schemaRefs>
+</ds:datastoreItem>
 </file>
</xml_diff>

<commit_message>
minor instruction template updates
</commit_message>
<xml_diff>
--- a/docassemble/MLHDivorceAndCustody/data/templates/instructions.docx
+++ b/docassemble/MLHDivorceAndCustody/data/templates/instructions.docx
@@ -7,45 +7,13 @@
         <w:pStyle w:val="Normalforinsertedinstructions"/>
       </w:pPr>
       <w:r>
-        <w:t>{{p include_docx_template('</w:t>
-      </w:r>
-      <w:proofErr w:type="gramStart"/>
-      <w:r>
-        <w:t>docassemble.mlhframework</w:t>
-      </w:r>
-      <w:proofErr w:type="gramEnd"/>
-      <w:r>
-        <w:t>:data/templates/cover_sheet_2.0.docx'</w:t>
-      </w:r>
-      <w:proofErr w:type="gramStart"/>
-      <w:r>
-        <w:t>) }</w:t>
-      </w:r>
-      <w:proofErr w:type="gramEnd"/>
-      <w:r>
-        <w:t>}</w:t>
+        <w:t>{{p include_docx_template('docassemble.mlhframework:data/templates/cover_sheet_2.0.docx') }}</w:t>
       </w:r>
     </w:p>
     <w:p/>
     <w:p>
       <w:r>
-        <w:t xml:space="preserve">{%p if </w:t>
-      </w:r>
-      <w:proofErr w:type="spellStart"/>
-      <w:r>
-        <w:t>tool_ID</w:t>
-      </w:r>
-      <w:proofErr w:type="spellEnd"/>
-      <w:r>
-        <w:t xml:space="preserve"> == “</w:t>
-      </w:r>
-      <w:proofErr w:type="spellStart"/>
-      <w:r>
-        <w:t>divorce_complaint</w:t>
-      </w:r>
-      <w:proofErr w:type="spellEnd"/>
-      <w:r>
-        <w:t>” %}</w:t>
+        <w:t>{%p if tool_ID == “divorce_complaint” %}</w:t>
       </w:r>
     </w:p>
     <w:p>
@@ -116,31 +84,7 @@
     </w:p>
     <w:p>
       <w:r>
-        <w:t xml:space="preserve">{%p </w:t>
-      </w:r>
-      <w:proofErr w:type="spellStart"/>
-      <w:r>
-        <w:t>elif</w:t>
-      </w:r>
-      <w:proofErr w:type="spellEnd"/>
-      <w:r>
-        <w:t xml:space="preserve"> </w:t>
-      </w:r>
-      <w:proofErr w:type="spellStart"/>
-      <w:r>
-        <w:t>tool_ID</w:t>
-      </w:r>
-      <w:proofErr w:type="spellEnd"/>
-      <w:r>
-        <w:t xml:space="preserve"> == “</w:t>
-      </w:r>
-      <w:proofErr w:type="spellStart"/>
-      <w:r>
-        <w:t>JOD_only</w:t>
-      </w:r>
-      <w:proofErr w:type="spellEnd"/>
-      <w:r>
-        <w:t>” %}</w:t>
+        <w:t>{%p elif tool_ID == “JOD_only” %}</w:t>
       </w:r>
     </w:p>
     <w:p>
@@ -208,31 +152,7 @@
     </w:p>
     <w:p>
       <w:r>
-        <w:t xml:space="preserve">{%p </w:t>
-      </w:r>
-      <w:proofErr w:type="spellStart"/>
-      <w:r>
-        <w:t>elif</w:t>
-      </w:r>
-      <w:proofErr w:type="spellEnd"/>
-      <w:r>
-        <w:t xml:space="preserve"> </w:t>
-      </w:r>
-      <w:proofErr w:type="spellStart"/>
-      <w:r>
-        <w:t>tool_ID</w:t>
-      </w:r>
-      <w:proofErr w:type="spellEnd"/>
-      <w:r>
-        <w:t xml:space="preserve"> == “</w:t>
-      </w:r>
-      <w:proofErr w:type="spellStart"/>
-      <w:r>
-        <w:t>divorce_answer</w:t>
-      </w:r>
-      <w:proofErr w:type="spellEnd"/>
-      <w:r>
-        <w:t>” %}</w:t>
+        <w:t>{%p elif tool_ID == “divorce_answer” %}</w:t>
       </w:r>
     </w:p>
     <w:p>
@@ -305,29 +225,11 @@
     </w:p>
     <w:p>
       <w:r>
-        <w:t xml:space="preserve">{%p </w:t>
-      </w:r>
-      <w:proofErr w:type="spellStart"/>
-      <w:r>
-        <w:t>elif</w:t>
-      </w:r>
-      <w:proofErr w:type="spellEnd"/>
-      <w:r>
-        <w:t xml:space="preserve"> </w:t>
-      </w:r>
-      <w:proofErr w:type="spellStart"/>
-      <w:r>
-        <w:t>tool_ID</w:t>
-      </w:r>
-      <w:proofErr w:type="spellEnd"/>
-      <w:r>
-        <w:t xml:space="preserve"> == “</w:t>
-      </w:r>
-      <w:proofErr w:type="spellStart"/>
+        <w:t>{%p elif tool_ID == “</w:t>
+      </w:r>
       <w:r>
         <w:t>custody_complaint</w:t>
       </w:r>
-      <w:proofErr w:type="spellEnd"/>
       <w:r>
         <w:t>” %}</w:t>
       </w:r>
@@ -400,13 +302,8 @@
     </w:p>
     <w:p>
       <w:r>
-        <w:t xml:space="preserve">{%p </w:t>
-      </w:r>
-      <w:proofErr w:type="gramStart"/>
-      <w:r>
-        <w:t>endif %}</w:t>
-      </w:r>
-      <w:proofErr w:type="gramEnd"/>
+        <w:t>{%p endif %}</w:t>
+      </w:r>
     </w:p>
     <w:p>
       <w:pPr>
@@ -430,7 +327,6 @@
           <w:szCs w:val="28"/>
         </w:rPr>
       </w:pPr>
-      <w:proofErr w:type="gramStart"/>
       <w:r>
         <w:rPr>
           <w:rFonts w:cs="Times New Roman"/>
@@ -452,40 +348,14 @@
           <w:noProof/>
           <w:szCs w:val="28"/>
         </w:rPr>
-        <w:t>cover</w:t>
-      </w:r>
-      <w:proofErr w:type="gramEnd"/>
-      <w:r>
-        <w:rPr>
-          <w:rFonts w:asciiTheme="minorHAnsi" w:hAnsiTheme="minorHAnsi" w:cstheme="minorHAnsi"/>
-          <w:noProof/>
+        <w:t xml:space="preserve">cover_sheet_thanks </w:t>
+      </w:r>
+      <w:r>
+        <w:rPr>
+          <w:rFonts w:asciiTheme="minorHAnsi" w:hAnsiTheme="minorHAnsi" w:cstheme="minorHAnsi"/>
           <w:szCs w:val="28"/>
         </w:rPr>
-        <w:t>_sheet_</w:t>
-      </w:r>
-      <w:proofErr w:type="gramStart"/>
-      <w:r>
-        <w:rPr>
-          <w:rFonts w:asciiTheme="minorHAnsi" w:hAnsiTheme="minorHAnsi" w:cstheme="minorHAnsi"/>
-          <w:noProof/>
-          <w:szCs w:val="28"/>
-        </w:rPr>
-        <w:t xml:space="preserve">thanks </w:t>
-      </w:r>
-      <w:r>
-        <w:rPr>
-          <w:rFonts w:asciiTheme="minorHAnsi" w:hAnsiTheme="minorHAnsi" w:cstheme="minorHAnsi"/>
-          <w:szCs w:val="28"/>
-        </w:rPr>
-        <w:t>}</w:t>
-      </w:r>
-      <w:proofErr w:type="gramEnd"/>
-      <w:r>
-        <w:rPr>
-          <w:rFonts w:asciiTheme="minorHAnsi" w:hAnsiTheme="minorHAnsi" w:cstheme="minorHAnsi"/>
-          <w:szCs w:val="28"/>
-        </w:rPr>
-        <w:t>}</w:t>
+        <w:t>}}</w:t>
       </w:r>
     </w:p>
     <w:p>
@@ -500,22 +370,48 @@
           <w:rFonts w:asciiTheme="minorHAnsi" w:hAnsiTheme="minorHAnsi" w:cstheme="minorHAnsi"/>
           <w:szCs w:val="28"/>
         </w:rPr>
-        <w:t xml:space="preserve">{%p if </w:t>
-      </w:r>
-      <w:proofErr w:type="spellStart"/>
+        <w:t xml:space="preserve">{%p if tool_ID </w:t>
+      </w:r>
       <w:r>
         <w:rPr>
           <w:rFonts w:asciiTheme="minorHAnsi" w:hAnsiTheme="minorHAnsi" w:cstheme="minorHAnsi"/>
           <w:szCs w:val="28"/>
         </w:rPr>
-        <w:t>tool_ID</w:t>
-      </w:r>
-      <w:proofErr w:type="spellEnd"/>
+        <w:t>in [</w:t>
+      </w:r>
       <w:r>
         <w:rPr>
           <w:rFonts w:asciiTheme="minorHAnsi" w:hAnsiTheme="minorHAnsi" w:cstheme="minorHAnsi"/>
           <w:szCs w:val="28"/>
         </w:rPr>
+        <w:t>“divorce_complaint”</w:t>
+      </w:r>
+      <w:r>
+        <w:rPr>
+          <w:rFonts w:asciiTheme="minorHAnsi" w:hAnsiTheme="minorHAnsi" w:cstheme="minorHAnsi"/>
+          <w:szCs w:val="28"/>
+        </w:rPr>
+        <w:t>, “divorce_answer”</w:t>
+      </w:r>
+      <w:r>
+        <w:rPr>
+          <w:rFonts w:asciiTheme="minorHAnsi" w:hAnsiTheme="minorHAnsi" w:cstheme="minorHAnsi"/>
+          <w:szCs w:val="28"/>
+        </w:rPr>
+        <w:t>, “custody_complaint”, “custody_answer”</w:t>
+      </w:r>
+      <w:r>
+        <w:rPr>
+          <w:rFonts w:asciiTheme="minorHAnsi" w:hAnsiTheme="minorHAnsi" w:cstheme="minorHAnsi"/>
+          <w:szCs w:val="28"/>
+        </w:rPr>
+        <w:t>]</w:t>
+      </w:r>
+      <w:r>
+        <w:rPr>
+          <w:rFonts w:asciiTheme="minorHAnsi" w:hAnsiTheme="minorHAnsi" w:cstheme="minorHAnsi"/>
+          <w:szCs w:val="28"/>
+        </w:rPr>
         <w:t xml:space="preserve"> </w:t>
       </w:r>
       <w:r>
@@ -523,357 +419,76 @@
           <w:rFonts w:asciiTheme="minorHAnsi" w:hAnsiTheme="minorHAnsi" w:cstheme="minorHAnsi"/>
           <w:szCs w:val="28"/>
         </w:rPr>
-        <w:t>in [</w:t>
+        <w:t xml:space="preserve">or (tool_ID == “JOD_only” and </w:t>
       </w:r>
       <w:r>
         <w:rPr>
           <w:rFonts w:asciiTheme="minorHAnsi" w:hAnsiTheme="minorHAnsi" w:cstheme="minorHAnsi"/>
           <w:szCs w:val="28"/>
         </w:rPr>
-        <w:t>“</w:t>
-      </w:r>
-      <w:proofErr w:type="spellStart"/>
+        <w:t>(</w:t>
+      </w:r>
       <w:r>
         <w:rPr>
           <w:rFonts w:asciiTheme="minorHAnsi" w:hAnsiTheme="minorHAnsi" w:cstheme="minorHAnsi"/>
           <w:szCs w:val="28"/>
         </w:rPr>
-        <w:t>divorce_complaint</w:t>
-      </w:r>
-      <w:proofErr w:type="spellEnd"/>
+        <w:t xml:space="preserve">(marriage.have_pension_retirement </w:t>
+      </w:r>
       <w:r>
         <w:rPr>
           <w:rFonts w:asciiTheme="minorHAnsi" w:hAnsiTheme="minorHAnsi" w:cstheme="minorHAnsi"/>
           <w:szCs w:val="28"/>
         </w:rPr>
-        <w:t>”</w:t>
+        <w:t xml:space="preserve">and marriage.pension_contributions_made </w:t>
       </w:r>
       <w:r>
         <w:rPr>
           <w:rFonts w:asciiTheme="minorHAnsi" w:hAnsiTheme="minorHAnsi" w:cstheme="minorHAnsi"/>
           <w:szCs w:val="28"/>
         </w:rPr>
-        <w:t>, “</w:t>
-      </w:r>
-      <w:proofErr w:type="spellStart"/>
+        <w:t xml:space="preserve">and not </w:t>
+      </w:r>
       <w:r>
         <w:rPr>
           <w:rFonts w:asciiTheme="minorHAnsi" w:hAnsiTheme="minorHAnsi" w:cstheme="minorHAnsi"/>
           <w:szCs w:val="28"/>
         </w:rPr>
-        <w:t>divorce_answer</w:t>
-      </w:r>
-      <w:proofErr w:type="spellEnd"/>
+        <w:lastRenderedPageBreak/>
+        <w:t>marriage.pension_retirement_accounts_keep_own) or (</w:t>
+      </w:r>
+      <w:r>
+        <w:rPr>
+          <w:rFonts w:asciiTheme="minorHAnsi" w:hAnsiTheme="minorHAnsi" w:cstheme="minorHAnsi"/>
+        </w:rPr>
+        <w:t>marriage.personal_property_need_items and marriage.accounts.filter(trigger_investment_reminder=True) | length &gt; 0</w:t>
+      </w:r>
       <w:r>
         <w:rPr>
           <w:rFonts w:asciiTheme="minorHAnsi" w:hAnsiTheme="minorHAnsi" w:cstheme="minorHAnsi"/>
           <w:szCs w:val="28"/>
         </w:rPr>
-        <w:t>”</w:t>
+        <w:t>) or (</w:t>
+      </w:r>
+      <w:r>
+        <w:rPr>
+          <w:rFonts w:asciiTheme="minorHAnsi" w:hAnsiTheme="minorHAnsi" w:cstheme="minorHAnsi"/>
+        </w:rPr>
+        <w:t>there_are_marital_children and (parentage_affidavit_revoke or parentage_order_revoke or parentage_marital_revoke)</w:t>
       </w:r>
       <w:r>
         <w:rPr>
           <w:rFonts w:asciiTheme="minorHAnsi" w:hAnsiTheme="minorHAnsi" w:cstheme="minorHAnsi"/>
           <w:szCs w:val="28"/>
         </w:rPr>
-        <w:t>, “</w:t>
-      </w:r>
-      <w:proofErr w:type="spellStart"/>
-      <w:r>
-        <w:rPr>
-          <w:rFonts w:asciiTheme="minorHAnsi" w:hAnsiTheme="minorHAnsi" w:cstheme="minorHAnsi"/>
-          <w:szCs w:val="28"/>
-        </w:rPr>
-        <w:t>custody_complaint</w:t>
-      </w:r>
-      <w:proofErr w:type="spellEnd"/>
-      <w:r>
-        <w:rPr>
-          <w:rFonts w:asciiTheme="minorHAnsi" w:hAnsiTheme="minorHAnsi" w:cstheme="minorHAnsi"/>
-          <w:szCs w:val="28"/>
-        </w:rPr>
-        <w:t>”, “</w:t>
-      </w:r>
-      <w:proofErr w:type="spellStart"/>
-      <w:r>
-        <w:rPr>
-          <w:rFonts w:asciiTheme="minorHAnsi" w:hAnsiTheme="minorHAnsi" w:cstheme="minorHAnsi"/>
-          <w:szCs w:val="28"/>
-        </w:rPr>
-        <w:t>custody_answer</w:t>
-      </w:r>
-      <w:proofErr w:type="spellEnd"/>
-      <w:r>
-        <w:rPr>
-          <w:rFonts w:asciiTheme="minorHAnsi" w:hAnsiTheme="minorHAnsi" w:cstheme="minorHAnsi"/>
-          <w:szCs w:val="28"/>
-        </w:rPr>
-        <w:t>”</w:t>
-      </w:r>
-      <w:r>
-        <w:rPr>
-          <w:rFonts w:asciiTheme="minorHAnsi" w:hAnsiTheme="minorHAnsi" w:cstheme="minorHAnsi"/>
-          <w:szCs w:val="28"/>
-        </w:rPr>
-        <w:t>]</w:t>
-      </w:r>
-      <w:r>
-        <w:rPr>
-          <w:rFonts w:asciiTheme="minorHAnsi" w:hAnsiTheme="minorHAnsi" w:cstheme="minorHAnsi"/>
-          <w:szCs w:val="28"/>
-        </w:rPr>
-        <w:t xml:space="preserve"> </w:t>
-      </w:r>
-      <w:r>
-        <w:rPr>
-          <w:rFonts w:asciiTheme="minorHAnsi" w:hAnsiTheme="minorHAnsi" w:cstheme="minorHAnsi"/>
-          <w:szCs w:val="28"/>
-        </w:rPr>
-        <w:t>or (</w:t>
-      </w:r>
-      <w:proofErr w:type="spellStart"/>
-      <w:r>
-        <w:rPr>
-          <w:rFonts w:asciiTheme="minorHAnsi" w:hAnsiTheme="minorHAnsi" w:cstheme="minorHAnsi"/>
-          <w:szCs w:val="28"/>
-        </w:rPr>
-        <w:t>tool_ID</w:t>
-      </w:r>
-      <w:proofErr w:type="spellEnd"/>
-      <w:r>
-        <w:rPr>
-          <w:rFonts w:asciiTheme="minorHAnsi" w:hAnsiTheme="minorHAnsi" w:cstheme="minorHAnsi"/>
-          <w:szCs w:val="28"/>
-        </w:rPr>
-        <w:t xml:space="preserve"> == “</w:t>
-      </w:r>
-      <w:proofErr w:type="spellStart"/>
-      <w:r>
-        <w:rPr>
-          <w:rFonts w:asciiTheme="minorHAnsi" w:hAnsiTheme="minorHAnsi" w:cstheme="minorHAnsi"/>
-          <w:szCs w:val="28"/>
-        </w:rPr>
-        <w:t>JOD_only</w:t>
-      </w:r>
-      <w:proofErr w:type="spellEnd"/>
-      <w:r>
-        <w:rPr>
-          <w:rFonts w:asciiTheme="minorHAnsi" w:hAnsiTheme="minorHAnsi" w:cstheme="minorHAnsi"/>
-          <w:szCs w:val="28"/>
-        </w:rPr>
-        <w:t xml:space="preserve">” and </w:t>
-      </w:r>
-      <w:r>
-        <w:rPr>
-          <w:rFonts w:asciiTheme="minorHAnsi" w:hAnsiTheme="minorHAnsi" w:cstheme="minorHAnsi"/>
-          <w:szCs w:val="28"/>
-        </w:rPr>
-        <w:t>(</w:t>
-      </w:r>
-      <w:r>
-        <w:rPr>
-          <w:rFonts w:asciiTheme="minorHAnsi" w:hAnsiTheme="minorHAnsi" w:cstheme="minorHAnsi"/>
-          <w:szCs w:val="28"/>
-        </w:rPr>
-        <w:t>(</w:t>
-      </w:r>
-      <w:proofErr w:type="spellStart"/>
-      <w:r>
-        <w:rPr>
-          <w:rFonts w:asciiTheme="minorHAnsi" w:hAnsiTheme="minorHAnsi" w:cstheme="minorHAnsi"/>
-          <w:szCs w:val="28"/>
-        </w:rPr>
-        <w:t>marriage.have_pension_retirement</w:t>
-      </w:r>
-      <w:proofErr w:type="spellEnd"/>
-      <w:r>
-        <w:rPr>
-          <w:rFonts w:asciiTheme="minorHAnsi" w:hAnsiTheme="minorHAnsi" w:cstheme="minorHAnsi"/>
-          <w:szCs w:val="28"/>
-        </w:rPr>
-        <w:t xml:space="preserve"> </w:t>
-      </w:r>
-      <w:r>
-        <w:rPr>
-          <w:rFonts w:asciiTheme="minorHAnsi" w:hAnsiTheme="minorHAnsi" w:cstheme="minorHAnsi"/>
-          <w:szCs w:val="28"/>
-        </w:rPr>
-        <w:t xml:space="preserve">and </w:t>
-      </w:r>
-      <w:proofErr w:type="spellStart"/>
-      <w:r>
-        <w:rPr>
-          <w:rFonts w:asciiTheme="minorHAnsi" w:hAnsiTheme="minorHAnsi" w:cstheme="minorHAnsi"/>
-          <w:szCs w:val="28"/>
-        </w:rPr>
-        <w:t>marriage.pension_contributions_made</w:t>
-      </w:r>
-      <w:proofErr w:type="spellEnd"/>
-      <w:r>
-        <w:rPr>
-          <w:rFonts w:asciiTheme="minorHAnsi" w:hAnsiTheme="minorHAnsi" w:cstheme="minorHAnsi"/>
-          <w:szCs w:val="28"/>
-        </w:rPr>
-        <w:t xml:space="preserve"> </w:t>
-      </w:r>
-      <w:r>
-        <w:rPr>
-          <w:rFonts w:asciiTheme="minorHAnsi" w:hAnsiTheme="minorHAnsi" w:cstheme="minorHAnsi"/>
-          <w:szCs w:val="28"/>
-        </w:rPr>
-        <w:t xml:space="preserve">and not </w:t>
-      </w:r>
-      <w:proofErr w:type="spellStart"/>
-      <w:r>
-        <w:rPr>
-          <w:rFonts w:asciiTheme="minorHAnsi" w:hAnsiTheme="minorHAnsi" w:cstheme="minorHAnsi"/>
-          <w:szCs w:val="28"/>
-        </w:rPr>
-        <w:lastRenderedPageBreak/>
-        <w:t>marriage.pension_retirement_accounts_keep_own</w:t>
-      </w:r>
-      <w:proofErr w:type="spellEnd"/>
-      <w:r>
-        <w:rPr>
-          <w:rFonts w:asciiTheme="minorHAnsi" w:hAnsiTheme="minorHAnsi" w:cstheme="minorHAnsi"/>
-          <w:szCs w:val="28"/>
-        </w:rPr>
         <w:t>) or (</w:t>
       </w:r>
-      <w:proofErr w:type="spellStart"/>
-      <w:r>
-        <w:rPr>
-          <w:rFonts w:asciiTheme="minorHAnsi" w:hAnsiTheme="minorHAnsi" w:cstheme="minorHAnsi"/>
-        </w:rPr>
-        <w:t>marriage.personal_property_need_items</w:t>
-      </w:r>
-      <w:proofErr w:type="spellEnd"/>
-      <w:r>
-        <w:rPr>
-          <w:rFonts w:asciiTheme="minorHAnsi" w:hAnsiTheme="minorHAnsi" w:cstheme="minorHAnsi"/>
-        </w:rPr>
-        <w:t xml:space="preserve"> and </w:t>
-      </w:r>
-      <w:proofErr w:type="spellStart"/>
-      <w:r>
-        <w:rPr>
-          <w:rFonts w:asciiTheme="minorHAnsi" w:hAnsiTheme="minorHAnsi" w:cstheme="minorHAnsi"/>
-        </w:rPr>
-        <w:t>marriage.accounts.filter</w:t>
-      </w:r>
-      <w:proofErr w:type="spellEnd"/>
-      <w:r>
-        <w:rPr>
-          <w:rFonts w:asciiTheme="minorHAnsi" w:hAnsiTheme="minorHAnsi" w:cstheme="minorHAnsi"/>
-        </w:rPr>
-        <w:t>(</w:t>
-      </w:r>
-      <w:proofErr w:type="spellStart"/>
-      <w:r>
-        <w:rPr>
-          <w:rFonts w:asciiTheme="minorHAnsi" w:hAnsiTheme="minorHAnsi" w:cstheme="minorHAnsi"/>
-        </w:rPr>
-        <w:t>trigger_investment_reminder</w:t>
-      </w:r>
-      <w:proofErr w:type="spellEnd"/>
-      <w:r>
-        <w:rPr>
-          <w:rFonts w:asciiTheme="minorHAnsi" w:hAnsiTheme="minorHAnsi" w:cstheme="minorHAnsi"/>
-        </w:rPr>
-        <w:t>=True) | length &gt; 0</w:t>
-      </w:r>
-      <w:r>
-        <w:rPr>
-          <w:rFonts w:asciiTheme="minorHAnsi" w:hAnsiTheme="minorHAnsi" w:cstheme="minorHAnsi"/>
-          <w:szCs w:val="28"/>
-        </w:rPr>
-        <w:t>) or (</w:t>
-      </w:r>
-      <w:proofErr w:type="spellStart"/>
-      <w:r>
-        <w:rPr>
-          <w:rFonts w:asciiTheme="minorHAnsi" w:hAnsiTheme="minorHAnsi" w:cstheme="minorHAnsi"/>
-        </w:rPr>
-        <w:t>there_are_marital_children</w:t>
-      </w:r>
-      <w:proofErr w:type="spellEnd"/>
-      <w:r>
-        <w:rPr>
-          <w:rFonts w:asciiTheme="minorHAnsi" w:hAnsiTheme="minorHAnsi" w:cstheme="minorHAnsi"/>
-        </w:rPr>
-        <w:t xml:space="preserve"> and (</w:t>
-      </w:r>
-      <w:proofErr w:type="spellStart"/>
-      <w:r>
-        <w:rPr>
-          <w:rFonts w:asciiTheme="minorHAnsi" w:hAnsiTheme="minorHAnsi" w:cstheme="minorHAnsi"/>
-        </w:rPr>
-        <w:t>parentage_affidavit_revoke</w:t>
-      </w:r>
-      <w:proofErr w:type="spellEnd"/>
-      <w:r>
-        <w:rPr>
-          <w:rFonts w:asciiTheme="minorHAnsi" w:hAnsiTheme="minorHAnsi" w:cstheme="minorHAnsi"/>
-        </w:rPr>
-        <w:t xml:space="preserve"> or </w:t>
-      </w:r>
-      <w:proofErr w:type="spellStart"/>
-      <w:r>
-        <w:rPr>
-          <w:rFonts w:asciiTheme="minorHAnsi" w:hAnsiTheme="minorHAnsi" w:cstheme="minorHAnsi"/>
-        </w:rPr>
-        <w:t>parentage_order_revoke</w:t>
-      </w:r>
-      <w:proofErr w:type="spellEnd"/>
-      <w:r>
-        <w:rPr>
-          <w:rFonts w:asciiTheme="minorHAnsi" w:hAnsiTheme="minorHAnsi" w:cstheme="minorHAnsi"/>
-        </w:rPr>
-        <w:t xml:space="preserve"> or </w:t>
-      </w:r>
-      <w:proofErr w:type="spellStart"/>
-      <w:r>
-        <w:rPr>
-          <w:rFonts w:asciiTheme="minorHAnsi" w:hAnsiTheme="minorHAnsi" w:cstheme="minorHAnsi"/>
-        </w:rPr>
-        <w:t>parentage_marital_revoke</w:t>
-      </w:r>
-      <w:proofErr w:type="spellEnd"/>
-      <w:r>
-        <w:rPr>
-          <w:rFonts w:asciiTheme="minorHAnsi" w:hAnsiTheme="minorHAnsi" w:cstheme="minorHAnsi"/>
-        </w:rPr>
-        <w:t>)</w:t>
-      </w:r>
-      <w:r>
-        <w:rPr>
-          <w:rFonts w:asciiTheme="minorHAnsi" w:hAnsiTheme="minorHAnsi" w:cstheme="minorHAnsi"/>
-          <w:szCs w:val="28"/>
-        </w:rPr>
-        <w:t>) or (</w:t>
-      </w:r>
-      <w:proofErr w:type="spellStart"/>
-      <w:r>
-        <w:rPr>
-          <w:rFonts w:asciiTheme="minorHAnsi" w:hAnsiTheme="minorHAnsi" w:cstheme="minorHAnsi"/>
-        </w:rPr>
-        <w:t>there_are_marital_children</w:t>
-      </w:r>
-      <w:proofErr w:type="spellEnd"/>
-      <w:r>
-        <w:rPr>
-          <w:rFonts w:asciiTheme="minorHAnsi" w:hAnsiTheme="minorHAnsi" w:cstheme="minorHAnsi"/>
-        </w:rPr>
-        <w:t xml:space="preserve"> and not </w:t>
-      </w:r>
-      <w:proofErr w:type="spellStart"/>
-      <w:r>
-        <w:rPr>
-          <w:rFonts w:asciiTheme="minorHAnsi" w:hAnsiTheme="minorHAnsi" w:cstheme="minorHAnsi"/>
-        </w:rPr>
-        <w:t>MI_has_jurisdiction_all_kids</w:t>
-      </w:r>
-      <w:proofErr w:type="spellEnd"/>
+      <w:r>
+        <w:rPr>
+          <w:rFonts w:asciiTheme="minorHAnsi" w:hAnsiTheme="minorHAnsi" w:cstheme="minorHAnsi"/>
+        </w:rPr>
+        <w:t>there_are_marital_children and not MI_has_jurisdiction_all_kids</w:t>
+      </w:r>
       <w:r>
         <w:rPr>
           <w:rFonts w:asciiTheme="minorHAnsi" w:hAnsiTheme="minorHAnsi" w:cstheme="minorHAnsi"/>
@@ -965,49 +580,7 @@
           <w:rFonts w:asciiTheme="minorHAnsi" w:hAnsiTheme="minorHAnsi" w:cstheme="minorHAnsi"/>
         </w:rPr>
         <w:lastRenderedPageBreak/>
-        <w:t xml:space="preserve">{{p </w:t>
-      </w:r>
-      <w:proofErr w:type="spellStart"/>
-      <w:r>
-        <w:rPr>
-          <w:rFonts w:asciiTheme="minorHAnsi" w:hAnsiTheme="minorHAnsi" w:cstheme="minorHAnsi"/>
-        </w:rPr>
-        <w:t>include_docx_</w:t>
-      </w:r>
-      <w:proofErr w:type="gramStart"/>
-      <w:r>
-        <w:rPr>
-          <w:rFonts w:asciiTheme="minorHAnsi" w:hAnsiTheme="minorHAnsi" w:cstheme="minorHAnsi"/>
-        </w:rPr>
-        <w:t>template</w:t>
-      </w:r>
-      <w:proofErr w:type="spellEnd"/>
-      <w:r>
-        <w:rPr>
-          <w:rFonts w:asciiTheme="minorHAnsi" w:hAnsiTheme="minorHAnsi" w:cstheme="minorHAnsi"/>
-        </w:rPr>
-        <w:t>(‘</w:t>
-      </w:r>
-      <w:proofErr w:type="gramEnd"/>
-      <w:r>
-        <w:rPr>
-          <w:rFonts w:asciiTheme="minorHAnsi" w:hAnsiTheme="minorHAnsi" w:cstheme="minorHAnsi"/>
-        </w:rPr>
-        <w:t>reminders_template.docx’</w:t>
-      </w:r>
-      <w:proofErr w:type="gramStart"/>
-      <w:r>
-        <w:rPr>
-          <w:rFonts w:asciiTheme="minorHAnsi" w:hAnsiTheme="minorHAnsi" w:cstheme="minorHAnsi"/>
-        </w:rPr>
-        <w:t>) }</w:t>
-      </w:r>
-      <w:proofErr w:type="gramEnd"/>
-      <w:r>
-        <w:rPr>
-          <w:rFonts w:asciiTheme="minorHAnsi" w:hAnsiTheme="minorHAnsi" w:cstheme="minorHAnsi"/>
-        </w:rPr>
-        <w:t>}</w:t>
+        <w:t>{{p include_docx_template(‘reminders_template.docx’) }}</w:t>
       </w:r>
     </w:p>
     <w:p>
@@ -1021,16 +594,8 @@
         <w:rPr>
           <w:rFonts w:asciiTheme="minorHAnsi" w:hAnsiTheme="minorHAnsi" w:cstheme="minorHAnsi"/>
         </w:rPr>
-        <w:t xml:space="preserve">{%p </w:t>
-      </w:r>
-      <w:proofErr w:type="gramStart"/>
-      <w:r>
-        <w:rPr>
-          <w:rFonts w:asciiTheme="minorHAnsi" w:hAnsiTheme="minorHAnsi" w:cstheme="minorHAnsi"/>
-        </w:rPr>
-        <w:t>endif %}</w:t>
-      </w:r>
-      <w:proofErr w:type="gramEnd"/>
+        <w:t>{%p endif %}</w:t>
+      </w:r>
     </w:p>
     <w:p>
       <w:pPr>
@@ -1043,16 +608,14 @@
         <w:rPr>
           <w:rFonts w:asciiTheme="minorHAnsi" w:hAnsiTheme="minorHAnsi" w:cstheme="minorHAnsi"/>
         </w:rPr>
-        <w:t xml:space="preserve">{%p if </w:t>
-      </w:r>
-      <w:proofErr w:type="spellStart"/>
-      <w:r>
-        <w:rPr>
-          <w:rFonts w:asciiTheme="minorHAnsi" w:hAnsiTheme="minorHAnsi" w:cstheme="minorHAnsi"/>
-        </w:rPr>
-        <w:t>tool_ID</w:t>
-      </w:r>
-      <w:proofErr w:type="spellEnd"/>
+        <w:t xml:space="preserve">{%p if tool_ID </w:t>
+      </w:r>
+      <w:r>
+        <w:rPr>
+          <w:rFonts w:asciiTheme="minorHAnsi" w:hAnsiTheme="minorHAnsi" w:cstheme="minorHAnsi"/>
+        </w:rPr>
+        <w:t>in</w:t>
+      </w:r>
       <w:r>
         <w:rPr>
           <w:rFonts w:asciiTheme="minorHAnsi" w:hAnsiTheme="minorHAnsi" w:cstheme="minorHAnsi"/>
@@ -1063,34 +626,14 @@
         <w:rPr>
           <w:rFonts w:asciiTheme="minorHAnsi" w:hAnsiTheme="minorHAnsi" w:cstheme="minorHAnsi"/>
         </w:rPr>
-        <w:t>in</w:t>
-      </w:r>
-      <w:r>
-        <w:rPr>
-          <w:rFonts w:asciiTheme="minorHAnsi" w:hAnsiTheme="minorHAnsi" w:cstheme="minorHAnsi"/>
-        </w:rPr>
-        <w:t xml:space="preserve"> </w:t>
-      </w:r>
-      <w:r>
-        <w:rPr>
-          <w:rFonts w:asciiTheme="minorHAnsi" w:hAnsiTheme="minorHAnsi" w:cstheme="minorHAnsi"/>
-        </w:rPr>
         <w:t>[</w:t>
       </w:r>
       <w:r>
         <w:rPr>
           <w:rFonts w:asciiTheme="minorHAnsi" w:hAnsiTheme="minorHAnsi" w:cstheme="minorHAnsi"/>
         </w:rPr>
-        <w:t>"</w:t>
-      </w:r>
-      <w:proofErr w:type="spellStart"/>
-      <w:r>
-        <w:rPr>
-          <w:rFonts w:asciiTheme="minorHAnsi" w:hAnsiTheme="minorHAnsi" w:cstheme="minorHAnsi"/>
-        </w:rPr>
-        <w:t>divorce_complaint</w:t>
-      </w:r>
-      <w:proofErr w:type="spellEnd"/>
+        <w:t>"divorce_complaint</w:t>
+      </w:r>
       <w:r>
         <w:rPr>
           <w:rFonts w:asciiTheme="minorHAnsi" w:hAnsiTheme="minorHAnsi" w:cstheme="minorHAnsi"/>
@@ -1101,41 +644,13 @@
         <w:rPr>
           <w:rFonts w:asciiTheme="minorHAnsi" w:hAnsiTheme="minorHAnsi" w:cstheme="minorHAnsi"/>
         </w:rPr>
-        <w:t xml:space="preserve"> “</w:t>
-      </w:r>
-      <w:proofErr w:type="spellStart"/>
-      <w:r>
-        <w:rPr>
-          <w:rFonts w:asciiTheme="minorHAnsi" w:hAnsiTheme="minorHAnsi" w:cstheme="minorHAnsi"/>
-        </w:rPr>
-        <w:t>divorce_answer</w:t>
-      </w:r>
-      <w:proofErr w:type="spellEnd"/>
-      <w:r>
-        <w:rPr>
-          <w:rFonts w:asciiTheme="minorHAnsi" w:hAnsiTheme="minorHAnsi" w:cstheme="minorHAnsi"/>
-        </w:rPr>
-        <w:t>”</w:t>
-      </w:r>
-      <w:r>
-        <w:rPr>
-          <w:rFonts w:asciiTheme="minorHAnsi" w:hAnsiTheme="minorHAnsi" w:cstheme="minorHAnsi"/>
-        </w:rPr>
-        <w:t>, “</w:t>
-      </w:r>
-      <w:proofErr w:type="spellStart"/>
-      <w:r>
-        <w:rPr>
-          <w:rFonts w:asciiTheme="minorHAnsi" w:hAnsiTheme="minorHAnsi" w:cstheme="minorHAnsi"/>
-        </w:rPr>
-        <w:t>custody_complaint</w:t>
-      </w:r>
-      <w:proofErr w:type="spellEnd"/>
-      <w:r>
-        <w:rPr>
-          <w:rFonts w:asciiTheme="minorHAnsi" w:hAnsiTheme="minorHAnsi" w:cstheme="minorHAnsi"/>
-        </w:rPr>
-        <w:t>”]</w:t>
+        <w:t xml:space="preserve"> “divorce_answer”</w:t>
+      </w:r>
+      <w:r>
+        <w:rPr>
+          <w:rFonts w:asciiTheme="minorHAnsi" w:hAnsiTheme="minorHAnsi" w:cstheme="minorHAnsi"/>
+        </w:rPr>
+        <w:t>, “custody_complaint”]</w:t>
       </w:r>
       <w:r>
         <w:rPr>
@@ -1163,65 +678,32 @@
       <w:r>
         <w:t xml:space="preserve"> if </w:t>
       </w:r>
-      <w:proofErr w:type="spellStart"/>
-      <w:r>
-        <w:t>tool_ID</w:t>
-      </w:r>
-      <w:proofErr w:type="spellEnd"/>
-      <w:r>
-        <w:t xml:space="preserve"> == "</w:t>
-      </w:r>
-      <w:proofErr w:type="spellStart"/>
-      <w:r>
-        <w:t>divorce_complaint</w:t>
-      </w:r>
-      <w:proofErr w:type="spellEnd"/>
+      <w:r>
+        <w:t>tool_ID == "divorce_complaint</w:t>
+      </w:r>
       <w:r>
         <w:t xml:space="preserve">" </w:t>
       </w:r>
       <w:r>
         <w:t xml:space="preserve">and </w:t>
       </w:r>
-      <w:proofErr w:type="spellStart"/>
-      <w:r>
-        <w:t>there_are_marital_</w:t>
-      </w:r>
-      <w:proofErr w:type="gramStart"/>
-      <w:r>
-        <w:t>children</w:t>
-      </w:r>
-      <w:proofErr w:type="spellEnd"/>
-      <w:r>
-        <w:t xml:space="preserve"> </w:t>
+      <w:r>
+        <w:t xml:space="preserve">there_are_marital_children </w:t>
       </w:r>
       <w:r>
         <w:t>%}</w:t>
       </w:r>
-      <w:proofErr w:type="gramEnd"/>
     </w:p>
     <w:p>
       <w:pPr>
         <w:pStyle w:val="Normalforinsertedinstructions"/>
       </w:pPr>
       <w:r>
-        <w:t xml:space="preserve">{{p </w:t>
-      </w:r>
-      <w:proofErr w:type="spellStart"/>
-      <w:r>
-        <w:t>include_docx_</w:t>
-      </w:r>
-      <w:proofErr w:type="gramStart"/>
-      <w:r>
-        <w:t>template</w:t>
-      </w:r>
-      <w:proofErr w:type="spellEnd"/>
-      <w:r>
-        <w:t>(</w:t>
+        <w:t>{{p include_docx_template(</w:t>
       </w:r>
       <w:r>
         <w:t>‘</w:t>
       </w:r>
-      <w:proofErr w:type="gramEnd"/>
       <w:r>
         <w:t>instructions_divorce_with_children</w:t>
       </w:r>
@@ -1231,13 +713,8 @@
       <w:r>
         <w:t>’</w:t>
       </w:r>
-      <w:proofErr w:type="gramStart"/>
-      <w:r>
-        <w:t>) }</w:t>
-      </w:r>
-      <w:proofErr w:type="gramEnd"/>
-      <w:r>
-        <w:t>}</w:t>
+      <w:r>
+        <w:t>) }}</w:t>
       </w:r>
     </w:p>
     <w:p>
@@ -1251,67 +728,31 @@
         <w:t>p</w:t>
       </w:r>
       <w:r>
-        <w:t xml:space="preserve"> </w:t>
-      </w:r>
-      <w:proofErr w:type="spellStart"/>
-      <w:r>
-        <w:t>elif</w:t>
-      </w:r>
-      <w:proofErr w:type="spellEnd"/>
-      <w:r>
-        <w:t xml:space="preserve"> </w:t>
-      </w:r>
-      <w:proofErr w:type="spellStart"/>
-      <w:r>
-        <w:t>tool_ID</w:t>
-      </w:r>
-      <w:proofErr w:type="spellEnd"/>
-      <w:r>
-        <w:t xml:space="preserve"> == "</w:t>
-      </w:r>
-      <w:proofErr w:type="spellStart"/>
-      <w:r>
-        <w:t>divorce_complaint</w:t>
-      </w:r>
-      <w:proofErr w:type="spellEnd"/>
+        <w:t xml:space="preserve"> elif tool_ID == "divorce_complaint</w:t>
+      </w:r>
       <w:r>
         <w:t xml:space="preserve">" </w:t>
       </w:r>
       <w:r>
         <w:t xml:space="preserve">and not </w:t>
       </w:r>
-      <w:proofErr w:type="spellStart"/>
-      <w:r>
-        <w:t>there_are_marital_</w:t>
-      </w:r>
-      <w:proofErr w:type="gramStart"/>
-      <w:r>
-        <w:t>children</w:t>
-      </w:r>
-      <w:proofErr w:type="spellEnd"/>
-      <w:r>
-        <w:t xml:space="preserve"> </w:t>
+      <w:r>
+        <w:t xml:space="preserve">there_are_marital_children </w:t>
       </w:r>
       <w:r>
         <w:t>%}</w:t>
       </w:r>
-      <w:proofErr w:type="gramEnd"/>
     </w:p>
     <w:p>
       <w:pPr>
         <w:pStyle w:val="Normalforinsertedinstructions"/>
       </w:pPr>
       <w:r>
-        <w:t>{{p include_docx_</w:t>
-      </w:r>
-      <w:proofErr w:type="gramStart"/>
-      <w:r>
-        <w:t>template(</w:t>
+        <w:t>{{p include_docx_template(</w:t>
       </w:r>
       <w:r>
         <w:t>‘</w:t>
       </w:r>
-      <w:proofErr w:type="gramEnd"/>
       <w:r>
         <w:t>instructions_divorce_with</w:t>
       </w:r>
@@ -1327,13 +768,8 @@
       <w:r>
         <w:t>’</w:t>
       </w:r>
-      <w:proofErr w:type="gramStart"/>
-      <w:r>
-        <w:t>) }</w:t>
-      </w:r>
-      <w:proofErr w:type="gramEnd"/>
-      <w:r>
-        <w:t>}</w:t>
+      <w:r>
+        <w:t>) }}</w:t>
       </w:r>
     </w:p>
     <w:p>
@@ -1341,63 +777,30 @@
         <w:pStyle w:val="Normalforinsertedinstructions"/>
       </w:pPr>
       <w:r>
-        <w:t xml:space="preserve">{% </w:t>
-      </w:r>
-      <w:proofErr w:type="spellStart"/>
-      <w:r>
-        <w:t>elif</w:t>
-      </w:r>
-      <w:proofErr w:type="spellEnd"/>
-      <w:r>
-        <w:t xml:space="preserve"> </w:t>
-      </w:r>
-      <w:proofErr w:type="spellStart"/>
-      <w:r>
-        <w:t>tool_ID</w:t>
-      </w:r>
-      <w:proofErr w:type="spellEnd"/>
-      <w:r>
-        <w:t xml:space="preserve"> == "</w:t>
-      </w:r>
-      <w:proofErr w:type="spellStart"/>
-      <w:r>
-        <w:t>divorce_answer</w:t>
-      </w:r>
-      <w:proofErr w:type="spellEnd"/>
-      <w:proofErr w:type="gramStart"/>
+        <w:t>{%</w:t>
+      </w:r>
+      <w:r>
+        <w:t>p</w:t>
+      </w:r>
+      <w:r>
+        <w:t xml:space="preserve"> elif tool_ID == "divorce_answer</w:t>
+      </w:r>
       <w:r>
         <w:t xml:space="preserve">" </w:t>
       </w:r>
       <w:r>
         <w:t>%}</w:t>
       </w:r>
-      <w:proofErr w:type="gramEnd"/>
     </w:p>
     <w:p>
       <w:pPr>
         <w:pStyle w:val="Normalforinsertedinstructions"/>
       </w:pPr>
       <w:r>
-        <w:t xml:space="preserve">{{p </w:t>
-      </w:r>
-      <w:proofErr w:type="spellStart"/>
-      <w:r>
-        <w:t>include_docx_</w:t>
-      </w:r>
-      <w:proofErr w:type="gramStart"/>
-      <w:r>
-        <w:t>template</w:t>
-      </w:r>
-      <w:proofErr w:type="spellEnd"/>
-      <w:r>
-        <w:t>(</w:t>
-      </w:r>
-      <w:r>
-        <w:t>‘</w:t>
-      </w:r>
-      <w:proofErr w:type="gramEnd"/>
-      <w:r>
-        <w:t>instructions_divorce_answer</w:t>
+        <w:t>{{p include_docx_template(</w:t>
+      </w:r>
+      <w:r>
+        <w:t>‘instructions_divorce_answer</w:t>
       </w:r>
       <w:r>
         <w:t>.docx</w:t>
@@ -1405,13 +808,8 @@
       <w:r>
         <w:t>’</w:t>
       </w:r>
-      <w:proofErr w:type="gramStart"/>
-      <w:r>
-        <w:t>) }</w:t>
-      </w:r>
-      <w:proofErr w:type="gramEnd"/>
-      <w:r>
-        <w:t>}</w:t>
+      <w:r>
+        <w:t>) }}</w:t>
       </w:r>
     </w:p>
     <w:p>
@@ -1419,52 +817,24 @@
         <w:pStyle w:val="Normalforinsertedinstructions"/>
       </w:pPr>
       <w:r>
-        <w:t xml:space="preserve">{%p </w:t>
-      </w:r>
-      <w:proofErr w:type="spellStart"/>
-      <w:r>
-        <w:t>elif</w:t>
-      </w:r>
-      <w:proofErr w:type="spellEnd"/>
-      <w:r>
-        <w:t xml:space="preserve"> </w:t>
-      </w:r>
-      <w:proofErr w:type="spellStart"/>
-      <w:r>
-        <w:t>tool_ID</w:t>
-      </w:r>
-      <w:proofErr w:type="spellEnd"/>
-      <w:r>
-        <w:t xml:space="preserve"> == "</w:t>
-      </w:r>
-      <w:proofErr w:type="spellStart"/>
+        <w:t>{%p elif tool_ID == "</w:t>
+      </w:r>
       <w:r>
         <w:t>custody_complaint</w:t>
       </w:r>
-      <w:proofErr w:type="spellEnd"/>
-      <w:proofErr w:type="gramStart"/>
       <w:r>
         <w:t xml:space="preserve">" </w:t>
       </w:r>
       <w:r>
         <w:t>%}</w:t>
       </w:r>
-      <w:proofErr w:type="gramEnd"/>
     </w:p>
     <w:p>
       <w:pPr>
         <w:pStyle w:val="Normalforinsertedinstructions"/>
       </w:pPr>
       <w:r>
-        <w:t xml:space="preserve">{{p </w:t>
-      </w:r>
-      <w:proofErr w:type="spellStart"/>
-      <w:r>
-        <w:t>include_docx_template</w:t>
-      </w:r>
-      <w:proofErr w:type="spellEnd"/>
-      <w:r>
-        <w:t>(</w:t>
+        <w:t>{{p include_docx_template(</w:t>
       </w:r>
       <w:r>
         <w:t>‘instructions_custody_complaint</w:t>
@@ -1475,13 +845,8 @@
       <w:r>
         <w:t>’</w:t>
       </w:r>
-      <w:proofErr w:type="gramStart"/>
-      <w:r>
-        <w:t>) }</w:t>
-      </w:r>
-      <w:proofErr w:type="gramEnd"/>
-      <w:r>
-        <w:t>}</w:t>
+      <w:r>
+        <w:t>) }}</w:t>
       </w:r>
     </w:p>
     <w:p>
@@ -1495,26 +860,16 @@
         <w:t>p</w:t>
       </w:r>
       <w:r>
-        <w:t xml:space="preserve"> </w:t>
-      </w:r>
-      <w:proofErr w:type="gramStart"/>
-      <w:r>
-        <w:t>endif %}</w:t>
-      </w:r>
-      <w:proofErr w:type="gramEnd"/>
+        <w:t xml:space="preserve"> endif %}</w:t>
+      </w:r>
     </w:p>
     <w:p>
       <w:pPr>
         <w:pStyle w:val="Normalforinsertedinstructions"/>
       </w:pPr>
       <w:r>
-        <w:t xml:space="preserve">{%p </w:t>
-      </w:r>
-      <w:proofErr w:type="gramStart"/>
-      <w:r>
-        <w:t>endif %}</w:t>
-      </w:r>
-      <w:proofErr w:type="gramEnd"/>
+        <w:t>{%p endif %}</w:t>
+      </w:r>
     </w:p>
     <w:p>
       <w:pPr>
@@ -1523,56 +878,39 @@
       <w:r>
         <w:t xml:space="preserve">{%p if </w:t>
       </w:r>
-      <w:proofErr w:type="spellStart"/>
-      <w:r>
-        <w:t>tool_ID</w:t>
-      </w:r>
-      <w:proofErr w:type="spellEnd"/>
+      <w:r>
+        <w:t xml:space="preserve">tool_ID </w:t>
+      </w:r>
+      <w:r>
+        <w:t>in</w:t>
+      </w:r>
       <w:r>
         <w:t xml:space="preserve"> </w:t>
       </w:r>
       <w:r>
-        <w:t>in</w:t>
-      </w:r>
-      <w:r>
-        <w:t xml:space="preserve"> </w:t>
-      </w:r>
-      <w:r>
         <w:t>[</w:t>
       </w:r>
       <w:r>
+        <w:t>"divorce_complaint</w:t>
+      </w:r>
+      <w:r>
         <w:t>"</w:t>
       </w:r>
-      <w:proofErr w:type="spellStart"/>
-      <w:r>
-        <w:t>divorce_complaint</w:t>
-      </w:r>
-      <w:proofErr w:type="spellEnd"/>
+      <w:r>
+        <w:t xml:space="preserve">, </w:t>
+      </w:r>
+      <w:r>
+        <w:t>"JOD_only</w:t>
+      </w:r>
       <w:r>
         <w:t>"</w:t>
       </w:r>
       <w:r>
-        <w:t xml:space="preserve">, </w:t>
-      </w:r>
-      <w:r>
-        <w:t>"</w:t>
-      </w:r>
-      <w:proofErr w:type="spellStart"/>
-      <w:r>
-        <w:t>JOD_only</w:t>
-      </w:r>
-      <w:proofErr w:type="spellEnd"/>
-      <w:r>
-        <w:t>"</w:t>
-      </w:r>
-      <w:proofErr w:type="gramStart"/>
-      <w:r>
         <w:t xml:space="preserve">] </w:t>
       </w:r>
       <w:r>
         <w:t>%}</w:t>
       </w:r>
-      <w:proofErr w:type="gramEnd"/>
     </w:p>
     <w:p>
       <w:r>
@@ -1585,37 +923,19 @@
       </w:pPr>
       <w:r>
         <w:lastRenderedPageBreak/>
-        <w:t xml:space="preserve">{{p </w:t>
-      </w:r>
-      <w:proofErr w:type="spellStart"/>
-      <w:r>
-        <w:t>include_docx_</w:t>
-      </w:r>
-      <w:proofErr w:type="gramStart"/>
-      <w:r>
-        <w:t>template</w:t>
-      </w:r>
-      <w:proofErr w:type="spellEnd"/>
-      <w:r>
-        <w:t>(</w:t>
+        <w:t>{{p include_docx_template(</w:t>
       </w:r>
       <w:r>
         <w:t>‘</w:t>
       </w:r>
-      <w:proofErr w:type="gramEnd"/>
       <w:r>
         <w:t>testimony_script.docx</w:t>
       </w:r>
       <w:r>
         <w:t>’</w:t>
       </w:r>
-      <w:proofErr w:type="gramStart"/>
-      <w:r>
-        <w:t>) }</w:t>
-      </w:r>
-      <w:proofErr w:type="gramEnd"/>
-      <w:r>
-        <w:t>}</w:t>
+      <w:r>
+        <w:t>) }}</w:t>
       </w:r>
     </w:p>
     <w:p>
@@ -1623,13 +943,8 @@
         <w:pStyle w:val="Normalforinsertedinstructions"/>
       </w:pPr>
       <w:r>
-        <w:t xml:space="preserve">{%p </w:t>
-      </w:r>
-      <w:proofErr w:type="gramStart"/>
-      <w:r>
-        <w:t>endif %}</w:t>
-      </w:r>
-      <w:proofErr w:type="gramEnd"/>
+        <w:t>{%p endif %}</w:t>
+      </w:r>
     </w:p>
     <w:sectPr>
       <w:type w:val="continuous"/>

</xml_diff>